<commit_message>
Add rich formatting to generated docx templates
Rebuild template generator to produce A4 page setup, centered bold
titles, proper indentation/spacing, and a bordered table for the
shareholder list, replacing the previous plain-text output.

Co-authored-by: Cursor <cursoragent@cursor.com>
</commit_message>
<xml_diff>
--- a/templates/consent_llc.docx
+++ b/templates/consent_llc.docx
@@ -4,122 +4,136 @@
   <w:body>
     <w:p>
       <w:pPr>
+        <w:jc w:val="center"/>
+        <w:spacing w:before="0" w:after="240" w:line="300" w:lineRule="auto"/>
         <w:rPr>
           <w:rFonts w:ascii="Yu Mincho" w:eastAsia="游明朝" w:hAnsi="Yu Mincho"/>
+          <w:sz w:val="30"/>
+          <w:b/>
         </w:rPr>
       </w:pPr>
       <w:r>
         <w:rPr>
           <w:rFonts w:ascii="Yu Mincho" w:eastAsia="游明朝" w:hAnsi="Yu Mincho"/>
+          <w:sz w:val="30"/>
+          <w:szCs w:val="30"/>
+          <w:b/>
+          <w:bCs/>
         </w:rPr>
         <w:t xml:space="preserve">総社員の同意書</w:t>
       </w:r>
     </w:p>
     <w:p>
       <w:pPr>
+        <w:spacing w:before="0" w:after="80" w:line="300" w:lineRule="auto"/>
         <w:rPr>
           <w:rFonts w:ascii="Yu Mincho" w:eastAsia="游明朝" w:hAnsi="Yu Mincho"/>
+          <w:sz w:val="21"/>
         </w:rPr>
       </w:pPr>
       <w:r>
         <w:rPr>
           <w:rFonts w:ascii="Yu Mincho" w:eastAsia="游明朝" w:hAnsi="Yu Mincho"/>
-        </w:rPr>
-        <w:t xml:space="preserve"/>
-      </w:r>
-    </w:p>
-    <w:p>
-      <w:pPr>
-        <w:rPr>
-          <w:rFonts w:ascii="Yu Mincho" w:eastAsia="游明朝" w:hAnsi="Yu Mincho"/>
-        </w:rPr>
-      </w:pPr>
-      <w:r>
-        <w:rPr>
-          <w:rFonts w:ascii="Yu Mincho" w:eastAsia="游明朝" w:hAnsi="Yu Mincho"/>
+          <w:sz w:val="21"/>
+          <w:szCs w:val="21"/>
         </w:rPr>
         <w:t xml:space="preserve">　商号　{company_name}</w:t>
       </w:r>
     </w:p>
     <w:p>
       <w:pPr>
+        <w:spacing w:before="0" w:after="0" w:line="300" w:lineRule="auto"/>
         <w:rPr>
           <w:rFonts w:ascii="Yu Mincho" w:eastAsia="游明朝" w:hAnsi="Yu Mincho"/>
+          <w:sz w:val="21"/>
+        </w:rPr>
+      </w:pPr>
+    </w:p>
+    <w:p>
+      <w:pPr>
+        <w:ind w:left="240"/>
+        <w:spacing w:before="0" w:after="80" w:line="300" w:lineRule="auto"/>
+        <w:rPr>
+          <w:rFonts w:ascii="Yu Mincho" w:eastAsia="游明朝" w:hAnsi="Yu Mincho"/>
+          <w:sz w:val="21"/>
         </w:rPr>
       </w:pPr>
       <w:r>
         <w:rPr>
           <w:rFonts w:ascii="Yu Mincho" w:eastAsia="游明朝" w:hAnsi="Yu Mincho"/>
-        </w:rPr>
-        <w:t xml:space="preserve"/>
-      </w:r>
-    </w:p>
-    <w:p>
-      <w:pPr>
-        <w:rPr>
-          <w:rFonts w:ascii="Yu Mincho" w:eastAsia="游明朝" w:hAnsi="Yu Mincho"/>
-        </w:rPr>
-      </w:pPr>
-      <w:r>
-        <w:rPr>
-          <w:rFonts w:ascii="Yu Mincho" w:eastAsia="游明朝" w:hAnsi="Yu Mincho"/>
+          <w:sz w:val="21"/>
+          <w:szCs w:val="21"/>
         </w:rPr>
         <w:t xml:space="preserve">　当会社の総社員は、定款を変更し、本店を{new_minimum_district}に置くことに同意した。</w:t>
       </w:r>
     </w:p>
     <w:p>
       <w:pPr>
+        <w:spacing w:before="0" w:after="0" w:line="300" w:lineRule="auto"/>
         <w:rPr>
           <w:rFonts w:ascii="Yu Mincho" w:eastAsia="游明朝" w:hAnsi="Yu Mincho"/>
+          <w:sz w:val="21"/>
+        </w:rPr>
+      </w:pPr>
+    </w:p>
+    <w:p>
+      <w:pPr>
+        <w:jc w:val="right"/>
+        <w:spacing w:before="0" w:after="80" w:line="300" w:lineRule="auto"/>
+        <w:rPr>
+          <w:rFonts w:ascii="Yu Mincho" w:eastAsia="游明朝" w:hAnsi="Yu Mincho"/>
+          <w:sz w:val="21"/>
         </w:rPr>
       </w:pPr>
       <w:r>
         <w:rPr>
           <w:rFonts w:ascii="Yu Mincho" w:eastAsia="游明朝" w:hAnsi="Yu Mincho"/>
-        </w:rPr>
-        <w:t xml:space="preserve"/>
-      </w:r>
-    </w:p>
-    <w:p>
-      <w:pPr>
-        <w:rPr>
-          <w:rFonts w:ascii="Yu Mincho" w:eastAsia="游明朝" w:hAnsi="Yu Mincho"/>
-        </w:rPr>
-      </w:pPr>
-      <w:r>
-        <w:rPr>
-          <w:rFonts w:ascii="Yu Mincho" w:eastAsia="游明朝" w:hAnsi="Yu Mincho"/>
+          <w:sz w:val="21"/>
+          <w:szCs w:val="21"/>
         </w:rPr>
         <w:t xml:space="preserve">　{meeting_date}</w:t>
       </w:r>
     </w:p>
     <w:p>
       <w:pPr>
+        <w:jc w:val="right"/>
+        <w:spacing w:before="0" w:after="80" w:line="300" w:lineRule="auto"/>
         <w:rPr>
           <w:rFonts w:ascii="Yu Mincho" w:eastAsia="游明朝" w:hAnsi="Yu Mincho"/>
+          <w:sz w:val="21"/>
         </w:rPr>
       </w:pPr>
       <w:r>
         <w:rPr>
           <w:rFonts w:ascii="Yu Mincho" w:eastAsia="游明朝" w:hAnsi="Yu Mincho"/>
+          <w:sz w:val="21"/>
+          <w:szCs w:val="21"/>
         </w:rPr>
         <w:t xml:space="preserve">　{company_name}</w:t>
       </w:r>
     </w:p>
     <w:p>
       <w:pPr>
+        <w:jc w:val="right"/>
+        <w:spacing w:before="0" w:after="80" w:line="300" w:lineRule="auto"/>
         <w:rPr>
           <w:rFonts w:ascii="Yu Mincho" w:eastAsia="游明朝" w:hAnsi="Yu Mincho"/>
+          <w:sz w:val="21"/>
         </w:rPr>
       </w:pPr>
       <w:r>
         <w:rPr>
           <w:rFonts w:ascii="Yu Mincho" w:eastAsia="游明朝" w:hAnsi="Yu Mincho"/>
+          <w:sz w:val="21"/>
+          <w:szCs w:val="21"/>
         </w:rPr>
         <w:t xml:space="preserve">　総社員</w:t>
       </w:r>
     </w:p>
-    <w:sectPr/>
+    <w:sectPr>
+      <w:pgSz w:w="11906" w:h="16838"/>
+      <w:pgMar w:top="1418" w:right="1418" w:bottom="1418" w:left="1418" w:header="851" w:footer="992" w:gutter="0"/>
+    </w:sectPr>
   </w:body>
 </w:document>
 </file>
</xml_diff>